<commit_message>
Anexo: las comisiones terminan con el contrato (solo lo recaudado hasta la fecha)
Co-Authored-By: Claude Opus 5.5 <noreply@anthropic.com>
</commit_message>
<xml_diff>
--- a/recursos/comercial/INDUCCION_COMERCIAL/contratacion comercial/ANEXO_COMPENSACION_EJECUTIVO_ALIANZAS_BORRADOR.docx
+++ b/recursos/comercial/INDUCCION_COMERCIAL/contratacion comercial/ANEXO_COMPENSACION_EJECUTIVO_ALIANZAS_BORRADOR.docx
@@ -78,7 +78,7 @@
           <w:i w:val="0"/>
           <w:sz w:val="21"/>
         </w:rPr>
-        <w:t>4. Comisiones causadas al terminar el contrato (cláusula 10): definir qué se paga de los recaudos posteriores a la terminación. Hoy está como PENDIENTE.</w:t>
+        <w:t>4. Terminación (cláusula 10): decisión de gerencia: a la terminación solo se pagan comisiones sobre lo recaudado hasta esa fecha; nada sobre recaudos posteriores ni cartera. Validar que la redacción sea suficiente y no se entienda como renuncia a derechos causados.</w:t>
       </w:r>
     </w:p>
     <w:p>
@@ -829,7 +829,7 @@
         <w:t xml:space="preserve">CLÁUSULA 10. ATRIBUCIÓN Y TERMINACIÓN. </w:t>
       </w:r>
       <w:r>
-        <w:t>Una empresa queda a nombre de EL TRABAJADOR cuando la registra primero en el tablero con fecha y soporte. Un estudiante se atribuye a una alianza cuando presenta la carta de postulación de la empresa aliada y no figuraba como prospecto de la academia antes de la fecha de firma del convenio. Los contratos firmados con pago inicial recibido cuentan para la meta aunque el grupo inicie en fecha posterior por capacidad de la academia. [PENDIENTE ABOGADO: comisiones sobre recaudos posteriores a la terminación del contrato.]</w:t>
+        <w:t>Una empresa queda a nombre de EL TRABAJADOR cuando la registra primero en el tablero con fecha y soporte. Un estudiante se atribuye a una alianza cuando presenta la carta de postulación de la empresa aliada y no figuraba como prospecto de la academia antes de la fecha de firma del convenio. Los contratos firmados con pago inicial recibido cuentan para la meta aunque el grupo inicie en fecha posterior por capacidad de la academia. A la terminación del contrato, por cualquier causa, EL TRABAJADOR tendrá derecho únicamente a las comisiones causadas sobre los valores recaudados hasta la fecha de terminación; los recaudos posteriores, incluida la cartera de alianzas, no generan comisión.</w:t>
       </w:r>
     </w:p>
     <w:p>

</xml_diff>

<commit_message>
Cartera de alianzas: 6% los 12 meses desde la firma de la matricula, 3% meses 13-24
Co-Authored-By: Claude Opus 5.5 <noreply@anthropic.com>
</commit_message>
<xml_diff>
--- a/recursos/comercial/INDUCCION_COMERCIAL/contratacion comercial/ANEXO_COMPENSACION_EJECUTIVO_ALIANZAS_BORRADOR.docx
+++ b/recursos/comercial/INDUCCION_COMERCIAL/contratacion comercial/ANEXO_COMPENSACION_EJECUTIVO_ALIANZAS_BORRADOR.docx
@@ -65,7 +65,7 @@
           <w:i w:val="0"/>
           <w:sz w:val="21"/>
         </w:rPr>
-        <w:t>3. Comisión de cartera decreciente (6% el primer año del estudiante, 3% el segundo, 0% después): validar redacción.</w:t>
+        <w:t>3. Comisión de cartera decreciente (6% en los 12 meses siguientes a la firma de la matrícula del estudiante, 3% del mes 13 al 24, 0% después): validar redacción.</w:t>
       </w:r>
     </w:p>
     <w:p>
@@ -216,7 +216,7 @@
         <w:t xml:space="preserve">CLÁUSULA 3. COMISIONES. </w:t>
       </w:r>
       <w:r>
-        <w:t>Sobre los valores efectivamente recaudados por EL EMPLEADOR, EL TRABAJADOR devengará: (a) plan empresa y programas personalizados cerrados por EL TRABAJADOR: diez por ciento (10%) del recaudo del primer año de cada contrato; (b) cartera de alianzas: por cada estudiante que se matricule con carta de postulación de una empresa aliada registrada a nombre de EL TRABAJADOR, seis por ciento (6%) de los pagos que ese estudiante realice durante sus primeros doce (12) meses y tres por ciento (3%) de los que realice entre los meses trece (13) y veinticuatro (24); a partir del mes veinticinco (25) del estudiante no se causa comisión de cartera. Las comisiones se liquidan mensualmente sobre lo recaudado en el mes anterior, no tienen tope y constituyen salario.</w:t>
+        <w:t>Sobre los valores efectivamente recaudados por EL EMPLEADOR, EL TRABAJADOR devengará: (a) plan empresa y programas personalizados cerrados por EL TRABAJADOR: diez por ciento (10%) del recaudo del primer año de cada contrato; (b) cartera de alianzas: por cada estudiante que se matricule con carta de postulación de una empresa aliada registrada a nombre de EL TRABAJADOR, seis por ciento (6%) de los pagos que ese estudiante realice durante los doce (12) meses siguientes a la fecha de firma de su contrato de matrícula, y tres por ciento (3%) de los que realice entre los meses trece (13) y veinticuatro (24) contados desde esa misma fecha; a partir del mes veinticinco (25) no se causa comisión de cartera. Las comisiones se liquidan mensualmente sobre lo recaudado en el mes anterior, no tienen tope y constituyen salario.</w:t>
       </w:r>
     </w:p>
     <w:p>
@@ -859,7 +859,7 @@
         <w:t xml:space="preserve">CLÁUSULA 12. SEGUIMIENTO. </w:t>
       </w:r>
       <w:r>
-        <w:t>Las partes sostendrán dos reuniones fijas semanales de treinta (30) minutos (lunes: plan de la semana; jueves: resultados frente a la meta y ajustes). EL TRABAJADOR tiene autonomía para organizar su agenda y sus visitas.</w:t>
+        <w:t>EL TRABAJADOR organiza su agenda y sus visitas. Las partes sostendrán una reunión diaria de seguimiento de quince (15) minutos a hora fija (resultados del día anterior frente al plan y plan del día) y una reunión semanal de planeación de treinta (30) minutos los lunes. EL TRABAJADOR mantendrá el tablero de alianzas actualizado el mismo día.</w:t>
       </w:r>
     </w:p>
     <w:p>

</xml_diff>

<commit_message>
Ejecutivo(a) de alianzas: T1 = $30M (6 programas + 1 Arranque), columna de programas completos por trimestre
Co-Authored-By: Claude Opus 5.5 <noreply@anthropic.com>
</commit_message>
<xml_diff>
--- a/recursos/comercial/INDUCCION_COMERCIAL/contratacion comercial/ANEXO_COMPENSACION_EJECUTIVO_ALIANZAS_BORRADOR.docx
+++ b/recursos/comercial/INDUCCION_COMERCIAL/contratacion comercial/ANEXO_COMPENSACION_EJECUTIVO_ALIANZAS_BORRADOR.docx
@@ -355,7 +355,7 @@
               <w:rPr>
                 <w:sz w:val="18"/>
               </w:rPr>
-              <w:t>$48.000.000 en el trimestre + indicadores de gestión</w:t>
+              <w:t>$30.000.000 en el trimestre + indicadores de gestión</w:t>
             </w:r>
           </w:p>
         </w:tc>
@@ -814,7 +814,7 @@
         <w:t xml:space="preserve">CLÁUSULA 9. INDICADORES DE GESTIÓN. </w:t>
       </w:r>
       <w:r>
-        <w:t>Cada mes EL TRABAJADOR deberá registrar en el tablero de alianzas de la academia, el mismo día, con su soporte: cuarenta (40) empresas contactadas con persona que toma la decisión, doce (12) reuniones de presentación de veinte (20) minutos o más con dicha persona y, en los meses 1 a 3, tres (3) activaciones de alianzas; desde el mes 4, al menos una activación por trimestre por cada alianza activa. Resultados mínimos del primer trimestre: mes 1, dos (2) firmas; mes 2, cuatro (4) firmas y cinco (5) cupos acumulados; mes 3, seis (6) firmas y diez (10) cupos acumulados. Una alianza que no registre activación en treinta (30) días desde su firma no cuenta como firma. Cuando no se alcancen los indicadores, las partes acordarán por escrito un plan de ajuste de una (1) semana con metas concretas. [PENDIENTE ABOGADO: consecuencias del incumplimiento reiterado.]</w:t>
+        <w:t>Cada mes EL TRABAJADOR deberá registrar en el tablero de alianzas de la academia, el mismo día, con su soporte: cuarenta (40) empresas contactadas con persona que toma la decisión, doce (12) reuniones de presentación de veinte (20) minutos o más con dicha persona y, en los meses 1 a 3, tres (3) activaciones de alianzas; desde el mes 4, al menos una activación por trimestre por cada alianza activa. Resultados mínimos del primer trimestre: mes 1, dos (2) firmas; mes 2, cuatro (4) firmas y ventas firmadas acumuladas por catorce millones de pesos ($14.000.000); mes 3, seis (6) firmas y ventas firmadas acumuladas por treinta millones de pesos ($30.000.000). Una alianza que no registre activación en treinta (30) días desde su firma no cuenta como firma. Cuando no se alcancen los indicadores, las partes acordarán por escrito un plan de ajuste de una (1) semana con metas concretas. [PENDIENTE ABOGADO: consecuencias del incumplimiento reiterado.]</w:t>
       </w:r>
     </w:p>
     <w:p>

</xml_diff>

<commit_message>
Ejecutivo(a) de alianzas: T1 = $30M al mes ($90M trimestre), resultados mes 1-3 en ventas acumuladas
Co-Authored-By: Claude Opus 5.5 <noreply@anthropic.com>
</commit_message>
<xml_diff>
--- a/recursos/comercial/INDUCCION_COMERCIAL/contratacion comercial/ANEXO_COMPENSACION_EJECUTIVO_ALIANZAS_BORRADOR.docx
+++ b/recursos/comercial/INDUCCION_COMERCIAL/contratacion comercial/ANEXO_COMPENSACION_EJECUTIVO_ALIANZAS_BORRADOR.docx
@@ -355,7 +355,7 @@
               <w:rPr>
                 <w:sz w:val="18"/>
               </w:rPr>
-              <w:t>$30.000.000 en el trimestre + indicadores de gestión</w:t>
+              <w:t>$90.000.000 en el trimestre ($30M/mes) + indicadores de gestión</w:t>
             </w:r>
           </w:p>
         </w:tc>
@@ -814,7 +814,7 @@
         <w:t xml:space="preserve">CLÁUSULA 9. INDICADORES DE GESTIÓN. </w:t>
       </w:r>
       <w:r>
-        <w:t>Cada mes EL TRABAJADOR deberá registrar en el tablero de alianzas de la academia, el mismo día, con su soporte: cuarenta (40) empresas contactadas con persona que toma la decisión, doce (12) reuniones de presentación de veinte (20) minutos o más con dicha persona y, en los meses 1 a 3, tres (3) activaciones de alianzas; desde el mes 4, al menos una activación por trimestre por cada alianza activa. Resultados mínimos del primer trimestre: mes 1, dos (2) firmas; mes 2, cuatro (4) firmas y ventas firmadas acumuladas por catorce millones de pesos ($14.000.000); mes 3, seis (6) firmas y ventas firmadas acumuladas por treinta millones de pesos ($30.000.000). Una alianza que no registre activación en treinta (30) días desde su firma no cuenta como firma. Cuando no se alcancen los indicadores, las partes acordarán por escrito un plan de ajuste de una (1) semana con metas concretas. [PENDIENTE ABOGADO: consecuencias del incumplimiento reiterado.]</w:t>
+        <w:t>Cada mes EL TRABAJADOR deberá registrar en el tablero de alianzas de la academia, el mismo día, con su soporte: cuarenta (40) empresas contactadas con persona que toma la decisión, doce (12) reuniones de presentación de veinte (20) minutos o más con dicha persona y, en los meses 1 a 3, tres (3) activaciones de alianzas; desde el mes 4, al menos una activación por trimestre por cada alianza activa. Resultados mínimos del primer trimestre: mes 1, dos (2) firmas y ventas firmadas por treinta millones de pesos ($30.000.000); mes 2, cuatro (4) firmas y ventas firmadas acumuladas por sesenta millones de pesos ($60.000.000); mes 3, seis (6) firmas y ventas firmadas acumuladas por noventa millones de pesos ($90.000.000). Una alianza que no registre activación en treinta (30) días desde su firma no cuenta como firma. Cuando no se alcancen los indicadores, las partes acordarán por escrito un plan de ajuste de una (1) semana con metas concretas. [PENDIENTE ABOGADO: consecuencias del incumplimiento reiterado.]</w:t>
       </w:r>
     </w:p>
     <w:p>

</xml_diff>

<commit_message>
Garantia $3.5M = gestion + firmas (lo prometido); $30M/mes es meta, no condicion; fix referencia clausula 9
Co-Authored-By: Claude Opus 5.5 <noreply@anthropic.com>
</commit_message>
<xml_diff>
--- a/recursos/comercial/INDUCCION_COMERCIAL/contratacion comercial/ANEXO_COMPENSACION_EJECUTIVO_ALIANZAS_BORRADOR.docx
+++ b/recursos/comercial/INDUCCION_COMERCIAL/contratacion comercial/ANEXO_COMPENSACION_EJECUTIVO_ALIANZAS_BORRADOR.docx
@@ -231,7 +231,7 @@
         <w:t xml:space="preserve">CLÁUSULA 4. INGRESO MÍNIMO GARANTIZADO (MESES 1 A 3). </w:t>
       </w:r>
       <w:r>
-        <w:t>Durante los tres (3) primeros meses de vigencia del contrato, en cada mes en que EL TRABAJADOR cumpla los indicadores de gestión del mes (cláusula 8), EL EMPLEADOR garantiza un ingreso total de TRES MILLONES QUINIENTOS MIL PESOS ($3.500.000), que incluye el básico y las comisiones del mes; si estos no alcanzan dicho valor, EL EMPLEADOR pagará la diferencia. Si las comisiones superan ese valor, se paga el total causado. En el mes en que no se cumplan los indicadores, no aplica la garantía y se paga el básico más las comisiones causadas.</w:t>
+        <w:t>Durante los tres (3) primeros meses de vigencia del contrato, en cada mes en que EL TRABAJADOR cumpla los indicadores de gestión y de firmas del mes (cláusula 9), EL EMPLEADOR garantiza un ingreso total de TRES MILLONES QUINIENTOS MIL PESOS ($3.500.000), que incluye el básico y las comisiones del mes; si estos no alcanzan dicho valor, EL EMPLEADOR pagará la diferencia. Si las comisiones superan ese valor, se paga el total causado. En el mes en que no se cumplan los indicadores, no aplica la garantía y se paga el básico más las comisiones causadas.</w:t>
       </w:r>
     </w:p>
     <w:p>
@@ -814,7 +814,7 @@
         <w:t xml:space="preserve">CLÁUSULA 9. INDICADORES DE GESTIÓN. </w:t>
       </w:r>
       <w:r>
-        <w:t>Cada mes EL TRABAJADOR deberá registrar en el tablero de alianzas de la academia, el mismo día, con su soporte: cuarenta (40) empresas contactadas con persona que toma la decisión, doce (12) reuniones de presentación de veinte (20) minutos o más con dicha persona y, en los meses 1 a 3, tres (3) activaciones de alianzas; desde el mes 4, al menos una activación por trimestre por cada alianza activa. Resultados mínimos del primer trimestre: mes 1, dos (2) firmas y ventas firmadas por treinta millones de pesos ($30.000.000); mes 2, cuatro (4) firmas y ventas firmadas acumuladas por sesenta millones de pesos ($60.000.000); mes 3, seis (6) firmas y ventas firmadas acumuladas por noventa millones de pesos ($90.000.000). Únicamente para el primer mes, los contratos firmados con pago inicial recibido dentro de los cinco (5) días calendario siguientes a su cierre se contabilizan como del mes 1. Una alianza que no registre activación en treinta (30) días desde su firma no cuenta como firma. Cuando no se alcancen los indicadores, las partes acordarán por escrito un plan de ajuste de una (1) semana con metas concretas. [PENDIENTE ABOGADO: consecuencias del incumplimiento reiterado.]</w:t>
+        <w:t>Cada mes EL TRABAJADOR deberá registrar en el tablero de alianzas de la academia, el mismo día, con su soporte: cuarenta (40) empresas contactadas con persona que toma la decisión, doce (12) reuniones de presentación de veinte (20) minutos o más con dicha persona y, en los meses 1 a 3, tres (3) activaciones de alianzas; desde el mes 4, al menos una activación por trimestre por cada alianza activa. Firmas mínimas del primer trimestre: mes 1, dos (2); mes 2, cuatro (4) acumuladas; mes 3, seis (6) acumuladas. La meta de ventas del primer trimestre (cláusula 5) es de treinta millones de pesos ($30.000.000) por mes y no es condición del ingreso mínimo garantizado. Únicamente para el primer mes, los contratos firmados con pago inicial recibido dentro de los cinco (5) días calendario siguientes a su cierre se contabilizan como del mes 1. Una alianza que no registre activación en treinta (30) días desde su firma no cuenta como firma. Cuando no se alcancen los indicadores, las partes acordarán por escrito un plan de ajuste de una (1) semana con metas concretas. [PENDIENTE ABOGADO: consecuencias del incumplimiento reiterado.]</w:t>
       </w:r>
     </w:p>
     <w:p>

</xml_diff>

<commit_message>
Ejecutivo(a) de alianzas: colegios y ferias, bases de datos propias (responsable de su gestion, cartera), cierre de apoyo
Co-Authored-By: Claude Opus 5.5 <noreply@anthropic.com>
</commit_message>
<xml_diff>
--- a/recursos/comercial/INDUCCION_COMERCIAL/contratacion comercial/ANEXO_COMPENSACION_EJECUTIVO_ALIANZAS_BORRADOR.docx
+++ b/recursos/comercial/INDUCCION_COMERCIAL/contratacion comercial/ANEXO_COMPENSACION_EJECUTIVO_ALIANZAS_BORRADOR.docx
@@ -186,7 +186,7 @@
         <w:t xml:space="preserve">CLÁUSULA 1. OBJETO DEL CARGO. </w:t>
       </w:r>
       <w:r>
-        <w:t>EL TRABAJADOR desarrollará el canal corporativo e institucional de la academia: prospección y relacionamiento con empresas, áreas de bienestar y fundaciones; presentación de la propuesta de valor; negociación y cierre de convenios de alianza (Heiiu Business Partner) y de órdenes de plan empresa; cierre de programas personalizados para ejecutivos; activación de las alianzas firmadas; y propuesta de nuevas oportunidades de programas y mercados. La atención de prospectos individuales que llegan por publicidad y canales digitales corresponde al equipo de asesoría comercial.</w:t>
+        <w:t>EL TRABAJADOR desarrollará el canal corporativo e institucional de la academia: prospección y relacionamiento con empresas, áreas de bienestar, fundaciones y colegios, incluida la participación en ferias escolares, universitarias y empresariales; presentación de la propuesta de valor; negociación y cierre de convenios de alianza (Heiiu Business Partner) y de órdenes de plan empresa; cierre de programas personalizados para ejecutivos; activación de las alianzas firmadas; y propuesta de nuevas oportunidades de programas y mercados. La atención de prospectos individuales que llegan por publicidad y canales digitales corresponde al equipo de asesoría comercial.</w:t>
       </w:r>
     </w:p>
     <w:p>
@@ -829,7 +829,7 @@
         <w:t xml:space="preserve">CLÁUSULA 10. ATRIBUCIÓN Y TERMINACIÓN. </w:t>
       </w:r>
       <w:r>
-        <w:t>Una empresa queda a nombre de EL TRABAJADOR cuando la registra primero en el tablero con fecha y soporte. Un estudiante se atribuye a una alianza cuando presenta la carta de postulación de la empresa aliada y no figuraba como prospecto de la academia antes de la fecha de firma del convenio. Los contratos firmados con pago inicial recibido cuentan para la meta aunque el grupo inicie en fecha posterior por capacidad de la academia. A la terminación del contrato, por cualquier causa, EL TRABAJADOR tendrá derecho únicamente a las comisiones causadas sobre los valores recaudados hasta la fecha de terminación; los recaudos posteriores, incluida la cartera de alianzas, no generan comisión.</w:t>
+        <w:t>Una empresa queda a nombre de EL TRABAJADOR cuando la registra primero en el tablero con fecha y soporte. Los contactos que EL TRABAJADOR genere en ferias, colegios, charlas y empresas se registran en el sistema de la academia dentro de las veinticuatro (24) horas siguientes; EL TRABAJADOR es responsable de que el equipo de asesoría los gestione, con o sin su presencia, y las matrículas que provengan de esas bases, registradas a su nombre antes del primer contacto de la asesora, generan la comisión de cartera de la cláusula 3(b). Cuando una asesora no pueda atender a un cliente y gerencia o coordinación lo asigne a EL TRABAJADOR, este podrá cerrar la matrícula y recibirá la comisión de cierre vigente para las asesoras; esas ventas no cuentan para su meta trimestral. Un estudiante se atribuye a una alianza cuando presenta la carta de postulación de la empresa aliada y no figuraba como prospecto de la academia antes de la fecha de firma del convenio. Los contratos firmados con pago inicial recibido cuentan para la meta aunque el grupo inicie en fecha posterior por capacidad de la academia. A la terminación del contrato, por cualquier causa, EL TRABAJADOR tendrá derecho únicamente a las comisiones causadas sobre los valores recaudados hasta la fecha de terminación; los recaudos posteriores, incluida la cartera de alianzas, no generan comisión.</w:t>
       </w:r>
     </w:p>
     <w:p>

</xml_diff>

<commit_message>
Ejecutivo(a) de alianzas: equipo de apoyo desde el dia 1 (asesoras en activaciones y matricula, coordinacion academica)
Co-Authored-By: Claude Opus 5.5 <noreply@anthropic.com>
</commit_message>
<xml_diff>
--- a/recursos/comercial/INDUCCION_COMERCIAL/contratacion comercial/ANEXO_COMPENSACION_EJECUTIVO_ALIANZAS_BORRADOR.docx
+++ b/recursos/comercial/INDUCCION_COMERCIAL/contratacion comercial/ANEXO_COMPENSACION_EJECUTIVO_ALIANZAS_BORRADOR.docx
@@ -856,10 +856,10 @@
         <w:rPr>
           <w:b/>
         </w:rPr>
-        <w:t xml:space="preserve">CLÁUSULA 12. SEGUIMIENTO. </w:t>
+        <w:t xml:space="preserve">CLÁUSULA 12. SEGUIMIENTO Y EQUIPO. </w:t>
       </w:r>
       <w:r>
-        <w:t>EL TRABAJADOR organiza su agenda y sus visitas. Las partes sostendrán una reunión diaria de seguimiento de quince (15) minutos a hora fija (resultados del día anterior frente al plan y plan del día) y una reunión semanal de planeación de treinta (30) minutos los lunes. EL TRABAJADOR mantendrá el tablero de alianzas actualizado el mismo día.</w:t>
+        <w:t>El equipo de asesoría comercial apoya a EL TRABAJADOR en las activaciones (charlas, ferias, jornadas de inscripción) y en la matrícula de los interesados del canal, y coordinación académica en las clases de muestra y diagnósticos. EL TRABAJADOR organiza su agenda y sus visitas. Las partes sostendrán una reunión diaria de seguimiento de quince (15) minutos a hora fija (resultados del día anterior frente al plan y plan del día) y una reunión semanal de planeación de treinta (30) minutos los lunes. EL TRABAJADOR mantendrá el tablero de alianzas actualizado el mismo día.</w:t>
       </w:r>
     </w:p>
     <w:p>

</xml_diff>

<commit_message>
Candidato 1 de alianzas: carta de oferta (indefinido, prueba 2 meses, inicio 27/10, 2 dias en sede, sin personal a cargo, territorio salud, revision 11/12); anexo de compensacion con contrato indefinido, sede, sin equipo y clausula de territorio
Co-Authored-By: Claude Fable 5.1 <noreply@anthropic.com>
</commit_message>
<xml_diff>
--- a/recursos/comercial/INDUCCION_COMERCIAL/contratacion comercial/ANEXO_COMPENSACION_EJECUTIVO_ALIANZAS_BORRADOR.docx
+++ b/recursos/comercial/INDUCCION_COMERCIAL/contratacion comercial/ANEXO_COMPENSACION_EJECUTIVO_ALIANZAS_BORRADOR.docx
@@ -104,7 +104,7 @@
           <w:i w:val="0"/>
           <w:sz w:val="21"/>
         </w:rPr>
-        <w:t>6. Período de prueba y tipo de contrato: indicar lo recomendable para este cargo.</w:t>
+        <w:t>6. Tipo de contrato y período de prueba (decisión de gerencia): contrato a término INDEFINIDO con período de prueba de DOS (2) MESES. Redactar la terminación dentro del período de prueba con causa objetiva documentada (indicadores de gestión y resultados registrados en el tablero y en las actas de seguimiento diario), de modo que la decisión al día 45 (revisión del 11/12/2026) quede soportada.</w:t>
       </w:r>
     </w:p>
     <w:p>
@@ -856,10 +856,10 @@
         <w:rPr>
           <w:b/>
         </w:rPr>
-        <w:t xml:space="preserve">CLÁUSULA 12. SEGUIMIENTO Y EQUIPO. </w:t>
+        <w:t xml:space="preserve">CLÁUSULA 12. SEGUIMIENTO, SEDE Y EQUIPO. </w:t>
       </w:r>
       <w:r>
-        <w:t>El equipo de asesoría comercial apoya a EL TRABAJADOR en las activaciones (charlas, ferias, jornadas de inscripción) y en la matrícula de los interesados del canal, y coordinación académica en las clases de muestra y diagnósticos. EL TRABAJADOR organiza su agenda y sus visitas. Las partes sostendrán una reunión diaria de seguimiento de quince (15) minutos a hora fija (resultados del día anterior frente al plan y plan del día) y una reunión semanal de planeación de treinta (30) minutos los lunes, ambas lideradas y preparadas por EL TRABAJADOR. EL TRABAJADOR mantendrá el tablero de alianzas actualizado el mismo día.</w:t>
+        <w:t>EL TRABAJADOR no tiene personal a cargo. El equipo de asesoría comercial apoya a EL TRABAJADOR en las activaciones (charlas, ferias, jornadas de inscripción) y en la matrícula de los interesados del canal, sin reportarle; coordinación académica apoya en diagnósticos de nivel. EL TRABAJADOR presta sus servicios dos (2) días fijos por semana en la sede de EL EMPLEADOR, con registro de asistencia, y los demás días en campo, organizando su agenda y sus visitas. Las partes sostendrán una reunión diaria de seguimiento de quince (15) minutos a hora fija (resultados del día anterior frente al plan y plan del día) y una reunión semanal de planeación de treinta (30) minutos los lunes, ambas lideradas y preparadas por EL TRABAJADOR, de las que queda registro escrito. EL TRABAJADOR mantendrá el tablero de alianzas actualizado el mismo día.</w:t>
       </w:r>
     </w:p>
     <w:p>
@@ -871,7 +871,22 @@
         <w:rPr>
           <w:b/>
         </w:rPr>
-        <w:t xml:space="preserve">CLÁUSULA 13. MODIFICACIONES. </w:t>
+        <w:t xml:space="preserve">CLÁUSULA 13. TERRITORIO. </w:t>
+      </w:r>
+      <w:r>
+        <w:t>EL EMPLEADOR asigna por escrito a EL TRABAJADOR los sectores o segmentos de empresas que atiende, y podrá ajustarlos por escrito según las necesidades del negocio, sin que ello constituya desmejora. Las empresas que EL TRABAJADOR registre primero en el tablero quedan a su nombre conforme a la cláusula 10, aun cuando pertenezcan a un sector distinto del asignado, salvo que ya estén registradas a nombre de otra persona.</w:t>
+      </w:r>
+    </w:p>
+    <w:p>
+      <w:pPr>
+        <w:spacing w:after="120"/>
+        <w:jc w:val="both"/>
+      </w:pPr>
+      <w:r>
+        <w:rPr>
+          <w:b/>
+        </w:rPr>
+        <w:t xml:space="preserve">CLÁUSULA 14. MODIFICACIONES. </w:t>
       </w:r>
       <w:r>
         <w:t>Ninguna meta, tasa de comisión, garantía o condición de este anexo podrá modificarse sin acuerdo escrito firmado por ambas partes (otrosí).</w:t>

</xml_diff>

<commit_message>
Oferta candidato 1 v2: Gerente de Alianzas, inicio 20/10, acelerador explicado, cartera queda en la empresa, 30M antes del cierre de la prueba, reuniones diarias (2 presenciales), responsable de la gestion del equipo, atribucion frente a otros comerciales, base de la academia para trabajarla, realidad de la empresa; anexo alineado (prueba, territorio, revision anual)
Co-Authored-By: Claude Fable 5.1 <noreply@anthropic.com>
</commit_message>
<xml_diff>
--- a/recursos/comercial/INDUCCION_COMERCIAL/contratacion comercial/ANEXO_COMPENSACION_EJECUTIVO_ALIANZAS_BORRADOR.docx
+++ b/recursos/comercial/INDUCCION_COMERCIAL/contratacion comercial/ANEXO_COMPENSACION_EJECUTIVO_ALIANZAS_BORRADOR.docx
@@ -814,7 +814,7 @@
         <w:t xml:space="preserve">CLÁUSULA 9. INDICADORES DE GESTIÓN. </w:t>
       </w:r>
       <w:r>
-        <w:t>Cada mes EL TRABAJADOR deberá registrar en el tablero de alianzas de la academia, el mismo día, con su soporte: cuarenta (40) empresas contactadas con persona que toma la decisión, doce (12) reuniones de presentación de veinte (20) minutos o más con dicha persona; activaciones de alianzas firmadas: dos (2) en el mes 2 y tres (3) en el mes 3; desde el mes 4, al menos una activación por trimestre por cada alianza activa. Firmas mínimas del primer trimestre: mes 1, dos (2); mes 2, cuatro (4) acumuladas; mes 3, seis (6) acumuladas. La meta de ventas del primer trimestre (cláusula 5) es de treinta millones de pesos ($30.000.000) por mes y no es condición del ingreso mínimo garantizado. Únicamente para el primer mes, los contratos firmados con pago inicial recibido dentro de los cinco (5) días calendario siguientes a su cierre se contabilizan como del mes 1. Una alianza que no registre activación en treinta (30) días desde su firma no cuenta como firma. Cuando no se alcancen los indicadores, las partes acordarán por escrito un plan de ajuste de una (1) semana con metas concretas. [PENDIENTE ABOGADO: consecuencias del incumplimiento reiterado.]</w:t>
+        <w:t>Cada mes EL TRABAJADOR deberá registrar en el tablero de alianzas de la academia, el mismo día, con su soporte: cuarenta (40) empresas contactadas con persona que toma la decisión, doce (12) reuniones de presentación de veinte (20) minutos o más con dicha persona; activaciones de alianzas firmadas: dos (2) en el mes 2 y tres (3) en el mes 3; desde el mes 4, al menos una activación por trimestre por cada alianza activa. Firmas mínimas del primer trimestre: mes 1, dos (2); mes 2, cuatro (4) acumuladas; mes 3, seis (6) acumuladas. La meta de ventas del primer trimestre (cláusula 5) es de treinta millones de pesos ($30.000.000) por mes y no es condición del ingreso mínimo garantizado. Evaluación del período de prueba: antes de su cierre, y a más tardar el día cuarenta y cinco (45) del contrato, EL TRABAJADOR debe acreditar ventas con pago recibido por al menos treinta millones de pesos ($30.000.000) por cualquier canal (plan empresa, alianzas, programas personalizados o base de la academia); ese resultado es criterio de la evaluación del período de prueba. Únicamente para el primer mes, los contratos firmados con pago inicial recibido dentro de los cinco (5) días calendario siguientes a su cierre se contabilizan como del mes 1. Una alianza que no registre activación en treinta (30) días desde su firma no cuenta como firma. Cuando no se alcancen los indicadores, las partes acordarán por escrito un plan de ajuste de una (1) semana con metas concretas. [PENDIENTE ABOGADO: consecuencias del incumplimiento reiterado.]</w:t>
       </w:r>
     </w:p>
     <w:p>
@@ -856,10 +856,10 @@
         <w:rPr>
           <w:b/>
         </w:rPr>
-        <w:t xml:space="preserve">CLÁUSULA 12. SEGUIMIENTO, SEDE Y EQUIPO. </w:t>
+        <w:t xml:space="preserve">CLÁUSULA 12. SEGUIMIENTO Y EQUIPO. </w:t>
       </w:r>
       <w:r>
-        <w:t>EL TRABAJADOR no tiene personal a cargo. El equipo de asesoría comercial apoya a EL TRABAJADOR en las activaciones (charlas, ferias, jornadas de inscripción) y en la matrícula de los interesados del canal, sin reportarle; coordinación académica apoya en diagnósticos de nivel. EL TRABAJADOR presta sus servicios dos (2) días fijos por semana en la sede de EL EMPLEADOR, con registro de asistencia, y los demás días en campo, organizando su agenda y sus visitas. Las partes sostendrán una reunión diaria de seguimiento de quince (15) minutos a hora fija (resultados del día anterior frente al plan y plan del día) y una reunión semanal de planeación de treinta (30) minutos los lunes, ambas lideradas y preparadas por EL TRABAJADOR, de las que queda registro escrito. EL TRABAJADOR mantendrá el tablero de alianzas actualizado el mismo día.</w:t>
+        <w:t>EL TRABAJADOR no tiene personal a cargo. El equipo de asesoría comercial apoya a EL TRABAJADOR en las activaciones (charlas, ferias, jornadas de inscripción) y en la matrícula de los interesados del canal, sin reportarle; coordinación académica apoya en diagnósticos de nivel. EL TRABAJADOR organiza su agenda y sus visitas. Las partes sostendrán una reunión diaria de seguimiento de quince (15) a treinta (30) minutos, de lunes a viernes a hora fija (resultados del día anterior frente al plan y plan del día), virtual salvo dos (2) días por semana en que es presencial en la sede de EL EMPLEADOR, con gerencia o con quien gerencia designe, y una reunión semanal de planeación de treinta (30) minutos los lunes, presencial; todas lideradas y preparadas por EL TRABAJADOR, con registro escrito. EL TRABAJADOR es responsable de que el equipo de asesoría gestione los interesados que él genere, les hace seguimiento y escala a gerencia lo que no avance. EL TRABAJADOR mantendrá el tablero de alianzas actualizado el mismo día.</w:t>
       </w:r>
     </w:p>
     <w:p>
@@ -871,10 +871,10 @@
         <w:rPr>
           <w:b/>
         </w:rPr>
-        <w:t xml:space="preserve">CLÁUSULA 13. TERRITORIO. </w:t>
+        <w:t xml:space="preserve">CLÁUSULA 13. TERRITORIO Y OTROS COMERCIALES. </w:t>
       </w:r>
       <w:r>
-        <w:t>EL EMPLEADOR asigna por escrito a EL TRABAJADOR los sectores o segmentos de empresas que atiende, y podrá ajustarlos por escrito según las necesidades del negocio, sin que ello constituya desmejora. Las empresas que EL TRABAJADOR registre primero en el tablero quedan a su nombre conforme a la cláusula 10, aun cuando pertenezcan a un sector distinto del asignado, salvo que ya estén registradas a nombre de otra persona.</w:t>
+        <w:t>EL EMPLEADOR asigna por escrito a EL TRABAJADOR los sectores o segmentos de empresas que atiende, y podrá ajustarlos por escrito según las necesidades del negocio, sin que ello constituya desmejora. EL EMPLEADOR puede tener otros comerciales B2B en otros sectores. Regla única de atribución: una empresa queda a nombre de quien la registre primero en el tablero, con sesenta (60) días para la primera reunión con quien decide; vencido ese plazo sin reunión, la empresa se libera. Los conflictos de atribución los resuelve EL EMPLEADOR por escrito.</w:t>
       </w:r>
     </w:p>
     <w:p>
@@ -886,10 +886,10 @@
         <w:rPr>
           <w:b/>
         </w:rPr>
-        <w:t xml:space="preserve">CLÁUSULA 14. MODIFICACIONES. </w:t>
+        <w:t xml:space="preserve">CLÁUSULA 14. REVISIÓN ANUAL Y MODIFICACIONES. </w:t>
       </w:r>
       <w:r>
-        <w:t>Ninguna meta, tasa de comisión, garantía o condición de este anexo podrá modificarse sin acuerdo escrito firmado por ambas partes (otrosí).</w:t>
+        <w:t>El esquema de comisiones, metas e indicadores de este anexo se revisa cada año, en diciembre, según el rendimiento y las condiciones del negocio. Ninguna meta, tasa de comisión, garantía o condición podrá modificarse sin acuerdo escrito firmado por ambas partes (otrosí), salvo los aumentos de meta ya pactados en las cláusulas 5 y 6.</w:t>
       </w:r>
     </w:p>
     <w:p>

</xml_diff>

<commit_message>
Anexo de compensacion: sin marca pendiente abogado en la clausula 9 (remite a faltas graves del contrato)
Co-Authored-By: Claude Fable 5.1 <noreply@anthropic.com>
</commit_message>
<xml_diff>
--- a/recursos/comercial/INDUCCION_COMERCIAL/contratacion comercial/ANEXO_COMPENSACION_EJECUTIVO_ALIANZAS_BORRADOR.docx
+++ b/recursos/comercial/INDUCCION_COMERCIAL/contratacion comercial/ANEXO_COMPENSACION_EJECUTIVO_ALIANZAS_BORRADOR.docx
@@ -158,7 +158,7 @@
           <w:i w:val="0"/>
           <w:sz w:val="22"/>
         </w:rPr>
-        <w:t>ESQUEMA DE COMPENSACIÓN, METAS E INDICADORES — EJECUTIVO(A) DE ALIANZAS EMPRESARIALES</w:t>
+        <w:t>ESQUEMA DE COMPENSACIÓN, METAS E INDICADORES — GERENTE DE ALIANZAS EMPRESARIALES</w:t>
       </w:r>
     </w:p>
     <w:p>
@@ -814,7 +814,7 @@
         <w:t xml:space="preserve">CLÁUSULA 9. INDICADORES DE GESTIÓN. </w:t>
       </w:r>
       <w:r>
-        <w:t>Cada mes EL TRABAJADOR deberá registrar en el tablero de alianzas de la academia, el mismo día, con su soporte: cuarenta (40) empresas contactadas con persona que toma la decisión, doce (12) reuniones de presentación de veinte (20) minutos o más con dicha persona; activaciones de alianzas firmadas: dos (2) en el mes 2 y tres (3) en el mes 3; desde el mes 4, al menos una activación por trimestre por cada alianza activa. Firmas mínimas del primer trimestre: mes 1, dos (2); mes 2, cuatro (4) acumuladas; mes 3, seis (6) acumuladas. La meta de ventas del primer trimestre (cláusula 5) es de treinta millones de pesos ($30.000.000) por mes y no es condición del ingreso mínimo garantizado. Evaluación del período de prueba, en dos cortes: al día treinta (30) del contrato, EL TRABAJADOR debe acreditar al menos una venta firmada con pago inicial recibido o una alianza activada; al día cuarenta y cinco (45), recaudo efectivo en caja de EL EMPLEADOR (pagos de contado e iniciales) por al menos treinta millones de pesos ($30.000.000), proveniente de ventas de EL TRABAJADOR por cualquier canal (plan empresa, alianzas, programas personalizados o base de la academia; para esta evaluación las ventas de la base de la academia se computan por el cien por ciento de su valor). Esos resultados son criterio de la evaluación del período de prueba y no modifican el ingreso mínimo garantizado de la cláusula 4. Únicamente para el primer mes, los contratos firmados con pago inicial recibido dentro de los cinco (5) días calendario siguientes a su cierre se contabilizan como del mes 1. Una alianza que no registre activación en treinta (30) días desde su firma no cuenta como firma. Cuando no se alcancen los indicadores, las partes acordarán por escrito un plan de ajuste de una (1) semana con metas concretas. [PENDIENTE ABOGADO: consecuencias del incumplimiento reiterado.]</w:t>
+        <w:t>Cada mes EL TRABAJADOR deberá registrar en el tablero de alianzas de la academia, el mismo día, con su soporte: cuarenta (40) empresas contactadas con persona que toma la decisión, doce (12) reuniones de presentación de veinte (20) minutos o más con dicha persona; activaciones de alianzas firmadas: dos (2) en el mes 2 y tres (3) en el mes 3; desde el mes 4, al menos una activación por trimestre por cada alianza activa. Firmas mínimas del primer trimestre: mes 1, dos (2); mes 2, cuatro (4) acumuladas; mes 3, seis (6) acumuladas. La meta de ventas del primer trimestre (cláusula 5) es de treinta millones de pesos ($30.000.000) por mes y no es condición del ingreso mínimo garantizado. Evaluación del período de prueba, en dos cortes: al día treinta (30) del contrato, EL TRABAJADOR debe acreditar al menos una venta firmada con pago inicial recibido o una alianza activada; al día cuarenta y cinco (45), recaudo efectivo en caja de EL EMPLEADOR (pagos de contado e iniciales) por al menos treinta millones de pesos ($30.000.000), proveniente de ventas de EL TRABAJADOR por cualquier canal (plan empresa, alianzas, programas personalizados o base de la academia; para esta evaluación las ventas de la base de la academia se computan por el cien por ciento de su valor). Esos resultados son criterio de la evaluación del período de prueba y no modifican el ingreso mínimo garantizado de la cláusula 4. Únicamente para el primer mes, los contratos firmados con pago inicial recibido dentro de los cinco (5) días calendario siguientes a su cierre se contabilizan como del mes 1. Una alianza que no registre activación en treinta (30) días desde su firma no cuenta como firma. Cuando no se alcancen los indicadores, las partes acordarán por escrito un plan de ajuste de una (1) semana con metas concretas. El incumplimiento reiterado de los indicadores, previo requerimiento escrito, se trata conforme a la cláusula NOVENA del contrato.</w:t>
       </w:r>
     </w:p>
     <w:p>
@@ -874,7 +874,7 @@
         <w:t xml:space="preserve">CLÁUSULA 13. TERRITORIO Y OTROS COMERCIALES. </w:t>
       </w:r>
       <w:r>
-        <w:t>EL EMPLEADOR asigna por escrito a EL TRABAJADOR los sectores o segmentos de empresas que atiende, y podrá ajustarlos por escrito según las necesidades del negocio, sin que ello constituya desmejora. EL EMPLEADOR puede tener otros comerciales B2B en otros sectores. Regla única de atribución: una empresa queda a nombre de quien la registre primero en el tablero, con sesenta (60) días para la primera reunión con quien decide; vencido ese plazo sin reunión, la empresa se libera. Los conflictos de atribución los resuelve EL EMPLEADOR por escrito.</w:t>
+        <w:t>EL EMPLEADOR asigna por escrito a EL TRABAJADOR los sectores o segmentos de empresas que atiende, y podrá ajustarlos por escrito según las necesidades del negocio, sin que ello constituya desmejora. EL EMPLEADOR puede tener otros comerciales B2B en otros sectores. Regla única de atribución: una empresa queda a nombre de quien la registre primero en el tablero, con sesenta (60) días para la primera reunión con quien decide; vencido ese plazo sin reunión, la empresa se libera. Los conflictos de atribución los resuelve EL EMPLEADOR por escrito. Cuando EL EMPLEADOR ajuste los sectores asignados, las empresas ya registradas a nombre de EL TRABAJADOR se mantienen a su nombre, y si el ajuste reduce su mercado, las metas se ajustarán proporcionalmente mediante otrosí.</w:t>
       </w:r>
     </w:p>
     <w:p>
@@ -889,7 +889,7 @@
         <w:t xml:space="preserve">CLÁUSULA 14. REVISIÓN ANUAL Y MODIFICACIONES. </w:t>
       </w:r>
       <w:r>
-        <w:t>El esquema de comisiones, metas e indicadores de este anexo se revisa cada año, en diciembre, según el rendimiento y las condiciones del negocio. Ninguna meta, tasa de comisión, garantía o condición podrá modificarse sin acuerdo escrito firmado por ambas partes (otrosí), salvo los aumentos de meta ya pactados en las cláusulas 5 y 6.</w:t>
+        <w:t>El esquema de comisiones, metas e indicadores de este anexo se revisa cada año, en diciembre, según el rendimiento y las condiciones del negocio. Ninguna meta, tasa de comisión, garantía o condición podrá modificarse sin acuerdo escrito firmado por ambas partes (otrosí), salvo los aumentos de meta ya pactados en las cláusulas 5 y 6. La revisión anual es una evaluación: sus conclusiones solo producen efecto si constan en otrosí firmado por ambas partes; los aumentos de meta de las cláusulas 5 y 6 aplican sin otrosí porque fueron aceptados desde la firma. Ninguna revisión podrá disminuir el salario básico alcanzado ni afectar comisiones ya causadas.</w:t>
       </w:r>
     </w:p>
     <w:p>

</xml_diff>